<commit_message>
Update WMS API documentation and service definitions
Replit-Commit-Author: Agent
</commit_message>
<xml_diff>
--- a/docs/xhaccp-wms-api-partner-guide.docx
+++ b/docs/xhaccp-wms-api-partner-guide.docx
@@ -4323,6 +4323,324 @@
         <w:rPr>
           <w:rStyle w:val="DataTypeTok"/>
         </w:rPr>
+        <w:t xml:space="preserve">"identifiers"</w:t>
+      </w:r>
+      <w:r>
+        <w:rPr>
+          <w:rStyle w:val="FunctionTok"/>
+        </w:rPr>
+        <w:t xml:space="preserve">:</w:t>
+      </w:r>
+      <w:r>
+        <w:rPr>
+          <w:rStyle w:val="NormalTok"/>
+        </w:rPr>
+        <w:t xml:space="preserve"> </w:t>
+      </w:r>
+      <w:r>
+        <w:rPr>
+          <w:rStyle w:val="FunctionTok"/>
+        </w:rPr>
+        <w:t xml:space="preserve">{</w:t>
+      </w:r>
+      <w:r>
+        <w:br/>
+      </w:r>
+      <w:r>
+        <w:rPr>
+          <w:rStyle w:val="NormalTok"/>
+        </w:rPr>
+        <w:t xml:space="preserve">        </w:t>
+      </w:r>
+      <w:r>
+        <w:rPr>
+          <w:rStyle w:val="DataTypeTok"/>
+        </w:rPr>
+        <w:t xml:space="preserve">"xhaccp_product_id"</w:t>
+      </w:r>
+      <w:r>
+        <w:rPr>
+          <w:rStyle w:val="FunctionTok"/>
+        </w:rPr>
+        <w:t xml:space="preserve">:</w:t>
+      </w:r>
+      <w:r>
+        <w:rPr>
+          <w:rStyle w:val="NormalTok"/>
+        </w:rPr>
+        <w:t xml:space="preserve"> </w:t>
+      </w:r>
+      <w:r>
+        <w:rPr>
+          <w:rStyle w:val="StringTok"/>
+        </w:rPr>
+        <w:t xml:space="preserve">"prod_123"</w:t>
+      </w:r>
+      <w:r>
+        <w:rPr>
+          <w:rStyle w:val="FunctionTok"/>
+        </w:rPr>
+        <w:t xml:space="preserve">,</w:t>
+      </w:r>
+      <w:r>
+        <w:br/>
+      </w:r>
+      <w:r>
+        <w:rPr>
+          <w:rStyle w:val="NormalTok"/>
+        </w:rPr>
+        <w:t xml:space="preserve">        </w:t>
+      </w:r>
+      <w:r>
+        <w:rPr>
+          <w:rStyle w:val="DataTypeTok"/>
+        </w:rPr>
+        <w:t xml:space="preserve">"slug"</w:t>
+      </w:r>
+      <w:r>
+        <w:rPr>
+          <w:rStyle w:val="FunctionTok"/>
+        </w:rPr>
+        <w:t xml:space="preserve">:</w:t>
+      </w:r>
+      <w:r>
+        <w:rPr>
+          <w:rStyle w:val="NormalTok"/>
+        </w:rPr>
+        <w:t xml:space="preserve"> </w:t>
+      </w:r>
+      <w:r>
+        <w:rPr>
+          <w:rStyle w:val="StringTok"/>
+        </w:rPr>
+        <w:t xml:space="preserve">"kit-etiquettes-haccp"</w:t>
+      </w:r>
+      <w:r>
+        <w:rPr>
+          <w:rStyle w:val="FunctionTok"/>
+        </w:rPr>
+        <w:t xml:space="preserve">,</w:t>
+      </w:r>
+      <w:r>
+        <w:br/>
+      </w:r>
+      <w:r>
+        <w:rPr>
+          <w:rStyle w:val="NormalTok"/>
+        </w:rPr>
+        <w:t xml:space="preserve">        </w:t>
+      </w:r>
+      <w:r>
+        <w:rPr>
+          <w:rStyle w:val="DataTypeTok"/>
+        </w:rPr>
+        <w:t xml:space="preserve">"product_code"</w:t>
+      </w:r>
+      <w:r>
+        <w:rPr>
+          <w:rStyle w:val="FunctionTok"/>
+        </w:rPr>
+        <w:t xml:space="preserve">:</w:t>
+      </w:r>
+      <w:r>
+        <w:rPr>
+          <w:rStyle w:val="NormalTok"/>
+        </w:rPr>
+        <w:t xml:space="preserve"> </w:t>
+      </w:r>
+      <w:r>
+        <w:rPr>
+          <w:rStyle w:val="StringTok"/>
+        </w:rPr>
+        <w:t xml:space="preserve">"XH-SET-L"</w:t>
+      </w:r>
+      <w:r>
+        <w:br/>
+      </w:r>
+      <w:r>
+        <w:rPr>
+          <w:rStyle w:val="NormalTok"/>
+        </w:rPr>
+        <w:t xml:space="preserve">      </w:t>
+      </w:r>
+      <w:r>
+        <w:rPr>
+          <w:rStyle w:val="FunctionTok"/>
+        </w:rPr>
+        <w:t xml:space="preserve">},</w:t>
+      </w:r>
+      <w:r>
+        <w:br/>
+      </w:r>
+      <w:r>
+        <w:rPr>
+          <w:rStyle w:val="NormalTok"/>
+        </w:rPr>
+        <w:t xml:space="preserve">      </w:t>
+      </w:r>
+      <w:r>
+        <w:rPr>
+          <w:rStyle w:val="DataTypeTok"/>
+        </w:rPr>
+        <w:t xml:space="preserve">"designation"</w:t>
+      </w:r>
+      <w:r>
+        <w:rPr>
+          <w:rStyle w:val="FunctionTok"/>
+        </w:rPr>
+        <w:t xml:space="preserve">:</w:t>
+      </w:r>
+      <w:r>
+        <w:rPr>
+          <w:rStyle w:val="NormalTok"/>
+        </w:rPr>
+        <w:t xml:space="preserve"> </w:t>
+      </w:r>
+      <w:r>
+        <w:rPr>
+          <w:rStyle w:val="FunctionTok"/>
+        </w:rPr>
+        <w:t xml:space="preserve">{</w:t>
+      </w:r>
+      <w:r>
+        <w:br/>
+      </w:r>
+      <w:r>
+        <w:rPr>
+          <w:rStyle w:val="NormalTok"/>
+        </w:rPr>
+        <w:t xml:space="preserve">        </w:t>
+      </w:r>
+      <w:r>
+        <w:rPr>
+          <w:rStyle w:val="DataTypeTok"/>
+        </w:rPr>
+        <w:t xml:space="preserve">"ro"</w:t>
+      </w:r>
+      <w:r>
+        <w:rPr>
+          <w:rStyle w:val="FunctionTok"/>
+        </w:rPr>
+        <w:t xml:space="preserve">:</w:t>
+      </w:r>
+      <w:r>
+        <w:rPr>
+          <w:rStyle w:val="NormalTok"/>
+        </w:rPr>
+        <w:t xml:space="preserve"> </w:t>
+      </w:r>
+      <w:r>
+        <w:rPr>
+          <w:rStyle w:val="StringTok"/>
+        </w:rPr>
+        <w:t xml:space="preserve">"Set de etichete HACCP"</w:t>
+      </w:r>
+      <w:r>
+        <w:rPr>
+          <w:rStyle w:val="FunctionTok"/>
+        </w:rPr>
+        <w:t xml:space="preserve">,</w:t>
+      </w:r>
+      <w:r>
+        <w:br/>
+      </w:r>
+      <w:r>
+        <w:rPr>
+          <w:rStyle w:val="NormalTok"/>
+        </w:rPr>
+        <w:t xml:space="preserve">        </w:t>
+      </w:r>
+      <w:r>
+        <w:rPr>
+          <w:rStyle w:val="DataTypeTok"/>
+        </w:rPr>
+        <w:t xml:space="preserve">"fr"</w:t>
+      </w:r>
+      <w:r>
+        <w:rPr>
+          <w:rStyle w:val="FunctionTok"/>
+        </w:rPr>
+        <w:t xml:space="preserve">:</w:t>
+      </w:r>
+      <w:r>
+        <w:rPr>
+          <w:rStyle w:val="NormalTok"/>
+        </w:rPr>
+        <w:t xml:space="preserve"> </w:t>
+      </w:r>
+      <w:r>
+        <w:rPr>
+          <w:rStyle w:val="StringTok"/>
+        </w:rPr>
+        <w:t xml:space="preserve">"Kit d'étiquettes HACCP"</w:t>
+      </w:r>
+      <w:r>
+        <w:rPr>
+          <w:rStyle w:val="FunctionTok"/>
+        </w:rPr>
+        <w:t xml:space="preserve">,</w:t>
+      </w:r>
+      <w:r>
+        <w:br/>
+      </w:r>
+      <w:r>
+        <w:rPr>
+          <w:rStyle w:val="NormalTok"/>
+        </w:rPr>
+        <w:t xml:space="preserve">        </w:t>
+      </w:r>
+      <w:r>
+        <w:rPr>
+          <w:rStyle w:val="DataTypeTok"/>
+        </w:rPr>
+        <w:t xml:space="preserve">"en"</w:t>
+      </w:r>
+      <w:r>
+        <w:rPr>
+          <w:rStyle w:val="FunctionTok"/>
+        </w:rPr>
+        <w:t xml:space="preserve">:</w:t>
+      </w:r>
+      <w:r>
+        <w:rPr>
+          <w:rStyle w:val="NormalTok"/>
+        </w:rPr>
+        <w:t xml:space="preserve"> </w:t>
+      </w:r>
+      <w:r>
+        <w:rPr>
+          <w:rStyle w:val="StringTok"/>
+        </w:rPr>
+        <w:t xml:space="preserve">"HACCP label kit"</w:t>
+      </w:r>
+      <w:r>
+        <w:br/>
+      </w:r>
+      <w:r>
+        <w:rPr>
+          <w:rStyle w:val="NormalTok"/>
+        </w:rPr>
+        <w:t xml:space="preserve">      </w:t>
+      </w:r>
+      <w:r>
+        <w:rPr>
+          <w:rStyle w:val="FunctionTok"/>
+        </w:rPr>
+        <w:t xml:space="preserve">},</w:t>
+      </w:r>
+      <w:r>
+        <w:br/>
+      </w:r>
+      <w:r>
+        <w:rPr>
+          <w:rStyle w:val="NormalTok"/>
+        </w:rPr>
+        <w:t xml:space="preserve">      </w:t>
+      </w:r>
+      <w:r>
+        <w:rPr>
+          <w:rStyle w:val="DataTypeTok"/>
+        </w:rPr>
         <w:t xml:space="preserve">"market"</w:t>
       </w:r>
       <w:r>
@@ -5552,28 +5870,137 @@
         <w:t xml:space="preserve"> </w:t>
       </w:r>
       <w:r>
-        <w:t xml:space="preserve">inventory updates. It may be</w:t>
-      </w:r>
-      <w:r>
-        <w:t xml:space="preserve"> </w:t>
-      </w:r>
-      <w:r>
-        <w:rPr>
-          <w:rStyle w:val="VerbatimChar"/>
-        </w:rPr>
-        <w:t xml:space="preserve">null</w:t>
-      </w:r>
-      <w:r>
-        <w:t xml:space="preserve"> </w:t>
-      </w:r>
-      <w:r>
-        <w:t xml:space="preserve">for products without a product code;</w:t>
-      </w:r>
-      <w:r>
-        <w:t xml:space="preserve"> </w:t>
-      </w:r>
-      <w:r>
-        <w:t xml:space="preserve">report those products to xHACCP before accepting orders that contain them.</w:t>
+        <w:t xml:space="preserve">inventory updates. Products without a product code are not returned by this</w:t>
+      </w:r>
+      <w:r>
+        <w:t xml:space="preserve"> </w:t>
+      </w:r>
+      <w:r>
+        <w:t xml:space="preserve">endpoint because they cannot be safely matched to incoming order lines.</w:t>
+      </w:r>
+    </w:p>
+    <w:p>
+      <w:pPr>
+        <w:pStyle w:val="BodyText"/>
+      </w:pPr>
+      <w:r>
+        <w:rPr>
+          <w:rStyle w:val="VerbatimChar"/>
+        </w:rPr>
+        <w:t xml:space="preserve">identifiers</w:t>
+      </w:r>
+      <w:r>
+        <w:t xml:space="preserve"> </w:t>
+      </w:r>
+      <w:r>
+        <w:t xml:space="preserve">contains stable values that SLL can use to match received goods</w:t>
+      </w:r>
+      <w:r>
+        <w:t xml:space="preserve"> </w:t>
+      </w:r>
+      <w:r>
+        <w:t xml:space="preserve">with the catalog. It always includes</w:t>
+      </w:r>
+      <w:r>
+        <w:t xml:space="preserve"> </w:t>
+      </w:r>
+      <w:r>
+        <w:rPr>
+          <w:rStyle w:val="VerbatimChar"/>
+        </w:rPr>
+        <w:t xml:space="preserve">xhaccp_product_id</w:t>
+      </w:r>
+      <w:r>
+        <w:t xml:space="preserve"> </w:t>
+      </w:r>
+      <w:r>
+        <w:t xml:space="preserve">and</w:t>
+      </w:r>
+      <w:r>
+        <w:t xml:space="preserve"> </w:t>
+      </w:r>
+      <w:r>
+        <w:rPr>
+          <w:rStyle w:val="VerbatimChar"/>
+        </w:rPr>
+        <w:t xml:space="preserve">slug</w:t>
+      </w:r>
+      <w:r>
+        <w:t xml:space="preserve">, and</w:t>
+      </w:r>
+      <w:r>
+        <w:t xml:space="preserve"> </w:t>
+      </w:r>
+      <w:r>
+        <w:t xml:space="preserve">includes the product code plus any other stored classification codes. The</w:t>
+      </w:r>
+      <w:r>
+        <w:t xml:space="preserve"> </w:t>
+      </w:r>
+      <w:r>
+        <w:t xml:space="preserve">object is extensible so EAN, vendor reference, or another identifier can be</w:t>
+      </w:r>
+      <w:r>
+        <w:t xml:space="preserve"> </w:t>
+      </w:r>
+      <w:r>
+        <w:t xml:space="preserve">added without changing the response shape.</w:t>
+      </w:r>
+    </w:p>
+    <w:p>
+      <w:pPr>
+        <w:pStyle w:val="BodyText"/>
+      </w:pPr>
+      <w:r>
+        <w:rPr>
+          <w:rStyle w:val="VerbatimChar"/>
+        </w:rPr>
+        <w:t xml:space="preserve">designation</w:t>
+      </w:r>
+      <w:r>
+        <w:t xml:space="preserve"> </w:t>
+      </w:r>
+      <w:r>
+        <w:t xml:space="preserve">is a locale-keyed object of available product names. It includes</w:t>
+      </w:r>
+      <w:r>
+        <w:t xml:space="preserve"> </w:t>
+      </w:r>
+      <w:r>
+        <w:t xml:space="preserve">all stored translations and adds the market's fallback locale (</w:t>
+      </w:r>
+      <w:r>
+        <w:rPr>
+          <w:rStyle w:val="VerbatimChar"/>
+        </w:rPr>
+        <w:t xml:space="preserve">ro</w:t>
+      </w:r>
+      <w:r>
+        <w:t xml:space="preserve">,</w:t>
+      </w:r>
+      <w:r>
+        <w:t xml:space="preserve"> </w:t>
+      </w:r>
+      <w:r>
+        <w:rPr>
+          <w:rStyle w:val="VerbatimChar"/>
+        </w:rPr>
+        <w:t xml:space="preserve">fr</w:t>
+      </w:r>
+      <w:r>
+        <w:t xml:space="preserve">, or</w:t>
+      </w:r>
+      <w:r>
+        <w:t xml:space="preserve"> </w:t>
+      </w:r>
+      <w:r>
+        <w:rPr>
+          <w:rStyle w:val="VerbatimChar"/>
+        </w:rPr>
+        <w:t xml:space="preserve">en</w:t>
+      </w:r>
+      <w:r>
+        <w:t xml:space="preserve">) from the shared product name when that translation is missing.</w:t>
       </w:r>
     </w:p>
     <w:p>

</xml_diff>

<commit_message>
Update admin dashboard features and API documentation
Replit-Commit-Author: Agent
</commit_message>
<xml_diff>
--- a/docs/xhaccp-wms-api-partner-guide.docx
+++ b/docs/xhaccp-wms-api-partner-guide.docx
@@ -29007,6 +29007,31 @@
     </w:p>
     <w:bookmarkEnd w:id="99"/>
     <w:bookmarkEnd w:id="100"/>
+    <w:p>
+      <w:r>
+        <w:br w:type="page"/>
+      </w:r>
+    </w:p>
+    <w:p>
+      <w:r>
+        <w:t>Optional EAN identifier</w:t>
+      </w:r>
+    </w:p>
+    <w:p>
+      <w:r>
+        <w:t>Products may have an optional EAN/GTIN identifier. The admin product form and Excel import/export support this field. Accepted values contain 8, 12, 13, or 14 digits.</w:t>
+      </w:r>
+    </w:p>
+    <w:p>
+      <w:r>
+        <w:t>When an EAN is stored, GET /catalog returns it in the identifiers object together with the product code used as SKU:</w:t>
+      </w:r>
+    </w:p>
+    <w:p>
+      <w:r>
+        <w:t>{"sku":"XH-SET-L","identifiers":{"xhaccp_product_id":"prod_123","slug":"kit-etiquettes-haccp","product_code":"XH-SET-L","ean":"5941234567890"}}</w:t>
+      </w:r>
+    </w:p>
     <w:sectPr/>
   </w:body>
 </w:document>

</xml_diff>